<commit_message>
Use a natural student voice in assignment
Co-authored-by: TheXKnight117 <TheXKnight117@users.noreply.github.com>
</commit_message>
<xml_diff>
--- a/Semana1_Apellido.docx
+++ b/Semana1_Apellido.docx
@@ -69,7 +69,7 @@
           <w:b w:val="0"/>
           <w:sz w:val="24"/>
         </w:rPr>
-        <w:t>El emisor y el receptor son fundamentales porque la comunicación efectiva no depende únicamente de enviar información, sino también de que esta sea comprendida correctamente. El emisor tiene la responsabilidad de formular un mensaje claro, coherente, verificable y apropiado para la situación. Además, debe escoger un canal adecuado y considerar las características de la audiencia antes de difundirlo. En el cortometraje, el supuesto aviso de bomba se propaga por redes sociales sin que los estudiantes conozcan con certeza su origen ni comprueben su autenticidad. Esto muestra un emisor poco responsable o difícil de identificar, cuyo mensaje se apoya en el temor para influir en las decisiones de otros. Por su parte, el receptor no es pasivo: debe interpretar, preguntar, contrastar fuentes y entregar retroalimentación. La mayoría de los jóvenes acepta el aviso como verdadero y decide no abordar el metro ni asistir a clases, mientras que solo dos estudiantes actúan de manera diferente y concurren al examen sorpresa. Por lo tanto, para que exista comunicación efectiva, el emisor debe transmitir con responsabilidad y el receptor debe escuchar o leer activamente, evaluar el contenido y verificarlo antes de actuar o reenviarlo.</w:t>
+        <w:t>Yo creo que el emisor y el receptor tienen la misma importancia, porque no basta con mandar un mensaje: también es necesario que la otra persona lo entienda bien. El emisor debe explicar la información de forma clara, decir de dónde viene y pensar si el medio que está usando es el correcto. En el cortometraje esto no ocurre, ya que el aviso de bomba aparece en las redes sociales y no queda claro quién lo escribió ni si es verdadero. A pesar de eso, casi todos los estudiantes confían en el mensaje y deciden no tomar el metro para ir a clases. El receptor también tiene una responsabilidad, porque debe leer con atención, hacer preguntas y comprobar la información antes de creerla o compartirla. En este caso, los jóvenes reaccionan por miedo y no buscan otra fuente que confirme la noticia. Solo dos estudiantes terminan asistiendo y realizan el examen sorpresa del profesor. Para mí, una buena comunicación se produce cuando el emisor entrega información clara y el receptor participa de manera activa, responde y se asegura de haber entendido. Si una de las dos partes falla, el mensaje puede provocar confusión y llevar a decisiones equivocadas.</w:t>
       </w:r>
     </w:p>
     <w:p>
@@ -97,7 +97,7 @@
           <w:b w:val="0"/>
           <w:sz w:val="24"/>
         </w:rPr>
-        <w:t>El canal influye directamente en la forma en que las personas interpretan, valoran y reaccionan frente a un mensaje. En la situación observada, las redes sociales permiten que el supuesto aviso de bomba circule de manera inmediata entre los estudiantes. Esa rapidez, sumada a la posibilidad de reenviar el contenido muchas veces, puede producir una apariencia de verdad: si varias personas repiten la misma información, los receptores pueden creer que está confirmada, aunque todos provengan de una sola fuente no identificada. El formato digital también reduce elementos importantes de la comunicación cara a cara, como el tono de voz, los gestos, la oportunidad de formular preguntas y la respuesta inmediata del emisor. Además, palabras como “bomba” y “peligro” generan miedo y urgencia, emociones que dificultan una evaluación serena del contenido. El carácter informal de las redes favorece una reacción espontánea y la difusión impulsiva. Así, el canal vuelve el mensaje persuasivo por su velocidad y alcance, pero no garantiza su confiabilidad. Un aviso de seguridad comunicado por una autoridad, el Metro o la institución educativa habría sido percibido como más legítimo y habría permitido confirmar las medidas que correspondía adoptar.</w:t>
+        <w:t>El canal influye mucho, porque una misma información puede generar reacciones distintas según dónde y cómo se comunique. En el video, el aviso se comparte por redes sociales, un medio que los estudiantes usan todos los días y al que le prestan atención rápidamente. Como el mensaje se difunde entre compañeros, varios piensan que debe ser cierto, aunque nadie muestre una fuente oficial. También pasa que, cuando una publicación se comparte muchas veces, parece más confiable de lo que realmente es. Las redes permiten informar en pocos segundos, pero no siempre entregan contexto ni dan la posibilidad de preguntarle al autor qué quiso decir. En una conversación presencial se podrían observar los gestos, el tono de voz y la seguridad de la persona, pero aquí esos elementos no están. Además, hablar de una bomba provoca miedo y hace que los estudiantes reaccionen antes de pensar con calma. Por eso el canal ayuda a que el aviso llegue rápido, pero también facilita que el rumor se agrande. Si la misma información hubiera aparecido en un comunicado del Metro, de la policía o del centro educativo, los estudiantes habrían tenido más razones para confiar y sabrían qué hacer.</w:t>
       </w:r>
     </w:p>
     <w:p>
@@ -125,7 +125,7 @@
           <w:b w:val="0"/>
           <w:sz w:val="24"/>
         </w:rPr>
-        <w:t>La principal barrera es la falta de verificación de la fuente, pues los estudiantes reciben el aviso mediante redes sociales y no interactúan con el supuesto remitente. También existe una barrera semántica: un mensaje breve, sin contexto ni detalles comprobables, puede interpretarse de distintas formas. A esto se suma el ruido informativo propio de las plataformas digitales, donde rumores, opiniones y datos reales aparecen mezclados. La repetición entre compañeros funciona como presión social y refuerza el contenido sin aportar evidencia nueva. El miedo provocado por una posible bomba constituye una barrera emocional, porque favorece decisiones apresuradas. Asimismo, la falta de retroalimentación impide aclarar quién emitió el aviso, cuándo ocurrió el hecho y qué instrucciones oficiales existen. Las redes sociales sí son útiles para comunicar con rapidez a una audiencia joven y numerosa, pero no son por sí solas el canal más adecuado para confirmar una emergencia. En un caso de seguridad, el mensaje debería provenir de canales oficiales del Metro, de las autoridades o de la institución educativa. Las redes podrían complementar esa información, siempre que indiquen la fuente, la hora, las instrucciones y un medio oficial donde verificarla.</w:t>
+        <w:t>En esta situación veo varias barreras de comunicación. La primera es que no se conoce al verdadero emisor, por lo que nadie sabe si el aviso viene de una autoridad o de otro estudiante. Otra barrera es que el mensaje parece tener pocos detalles: no se explica bien dónde está la bomba, a qué hora ocurrió el aviso ni quién confirmó la información. También hay mucho ruido en las redes sociales, porque allí se mezclan noticias, opiniones, bromas y rumores. El miedo es otra dificultad importante. Al tratarse de una posible bomba, los jóvenes se preocupan y toman una decisión rápida sin revisar primero si la información es real. Además, como casi todos piensan igual, se produce una especie de presión del grupo que hace más difícil cuestionar el mensaje. Considero que las redes sí sirven para avisar rápidamente a estudiantes, pero no son suficientes para una situación tan seria. Lo adecuado sería revisar primero los canales oficiales del Metro, la policía o la institución educativa. Las redes podrían usarse como apoyo, pero el mensaje tendría que incluir la fuente, la hora y un enlace oficial para comprobarlo.</w:t>
       </w:r>
     </w:p>
     <w:p>
@@ -153,7 +153,7 @@
           <w:b w:val="0"/>
           <w:sz w:val="24"/>
         </w:rPr>
-        <w:t>El cortometraje permite concluir que comunicar con rapidez no equivale a comunicar de manera efectiva. El aviso difundido por redes sociales sí logra persuadir a la mayoría de los estudiantes y modifica su conducta, porque deciden no usar el metro ni asistir a clases. Sin embargo, el proceso no es efectivo desde una perspectiva responsable: el origen del mensaje no está claro, la información no se verifica y no existe una interacción que permita resolver dudas. El resultado demuestra el poder del discurso digital y la facilidad con que una idea se amplifica cuando apela al miedo y circula dentro de un grupo. También evidencia una escucha poco activa, ya que los receptores aceptan y reproducen el contenido sin analizarlo críticamente. Para mejorar la comunicación, primero se debería identificar la fuente original y contrastar el aviso con medios oficiales. Después, sería necesario comunicar datos concretos, como el lugar, la hora, la autoridad responsable y las instrucciones de seguridad. Los estudiantes deberían evitar reenviar información no confirmada y consultar directamente al establecimiento educacional. Finalmente, la institución podría disponer de un canal oficial para emergencias y cambios académicos. Estas acciones aportarían claridad, retroalimentación, responsabilidad y confianza, elementos indispensables para una comunicación verdaderamente efectiva.</w:t>
+        <w:t>Después de ver el cortometraje, mi conclusión es que un mensaje puede influir mucho en las personas aunque no esté confirmado. El aviso funciona para convencer a la mayoría, porque los estudiantes deciden no usar el metro y tampoco van a clases. Sin embargo, yo no diría que la comunicación es realmente efectiva. Logra una reacción, pero la información no es clara, no se conoce su origen y los receptores no comprueban si es verdadera. El video muestra que las redes sociales tienen un gran poder para persuadir, especialmente cuando el mensaje provoca miedo o preocupación. También muestra que compartir algo muchas veces no lo convierte en verdad. Los estudiantes podrían haber buscado un aviso oficial, preguntado al profesor o revisado la información del Metro de Madrid antes de tomar una decisión. El mensaje también debería haber indicado quién lo emitió, cuándo ocurrió el hecho y cuáles eran las instrucciones. Pienso que se podría mejorar la escucha activa, la verificación de fuentes y la comunicación entre el centro educativo y sus estudiantes. De esa forma se evitarían rumores y cada persona podría decidir basándose en información confiable, no solamente en lo que otros publican.</w:t>
       </w:r>
     </w:p>
     <w:sectPr>

</xml_diff>

<commit_message>
Align assignment with weekly course concepts
Co-authored-by: TheXKnight117 <TheXKnight117@users.noreply.github.com>
</commit_message>
<xml_diff>
--- a/Semana1_Apellido.docx
+++ b/Semana1_Apellido.docx
@@ -69,7 +69,7 @@
           <w:b w:val="0"/>
           <w:sz w:val="24"/>
         </w:rPr>
-        <w:t>Yo creo que el emisor y el receptor tienen la misma importancia, porque no basta con mandar un mensaje: también es necesario que la otra persona lo entienda bien. El emisor debe explicar la información de forma clara, decir de dónde viene y pensar si el medio que está usando es el correcto. En el cortometraje esto no ocurre, ya que el aviso de bomba aparece en las redes sociales y no queda claro quién lo escribió ni si es verdadero. A pesar de eso, casi todos los estudiantes confían en el mensaje y deciden no tomar el metro para ir a clases. El receptor también tiene una responsabilidad, porque debe leer con atención, hacer preguntas y comprobar la información antes de creerla o compartirla. En este caso, los jóvenes reaccionan por miedo y no buscan otra fuente que confirme la noticia. Solo dos estudiantes terminan asistiendo y realizan el examen sorpresa del profesor. Para mí, una buena comunicación se produce cuando el emisor entrega información clara y el receptor participa de manera activa, responde y se asegura de haber entendido. Si una de las dos partes falla, el mensaje puede provocar confusión y llevar a decisiones equivocadas.</w:t>
+        <w:t>Yo creo que el emisor y el receptor tienen la misma importancia, porque no basta con mandar un mensaje: también es necesario que la otra persona lo entienda bien. Como vimos en el contenido de la semana, el emisor codifica la idea y debe expresarla con claridad y precisión. También debe decir de dónde viene la información y pensar si el canal que está usando es el correcto. En el cortometraje esto no ocurre, ya que el aviso de bomba aparece en las redes sociales y no queda claro quién lo escribió ni si es verdadero. A pesar de eso, casi todos los estudiantes confían en el mensaje y deciden no tomar el metro para ir a clases. El receptor también tiene una responsabilidad, porque es quien decodifica el mensaje. Debe leer con atención, hacer preguntas y comprobar la información antes de creerla o compartirla. En este caso, los jóvenes reaccionan por miedo y no buscan otra fuente que confirme la noticia. Solo dos estudiantes terminan asistiendo y realizan el examen sorpresa del profesor. Para mí, una buena comunicación se produce cuando el emisor entrega información clara y el receptor participa de manera activa. La retroalimentación permite responder y confirmar si el mensaje se entendió como esperaba el emisor. Si una de las dos partes falla, el mensaje puede provocar confusión y llevar a decisiones equivocadas.</w:t>
       </w:r>
     </w:p>
     <w:p>
@@ -97,7 +97,7 @@
           <w:b w:val="0"/>
           <w:sz w:val="24"/>
         </w:rPr>
-        <w:t>El canal influye mucho, porque una misma información puede generar reacciones distintas según dónde y cómo se comunique. En el video, el aviso se comparte por redes sociales, un medio que los estudiantes usan todos los días y al que le prestan atención rápidamente. Como el mensaje se difunde entre compañeros, varios piensan que debe ser cierto, aunque nadie muestre una fuente oficial. También pasa que, cuando una publicación se comparte muchas veces, parece más confiable de lo que realmente es. Las redes permiten informar en pocos segundos, pero no siempre entregan contexto ni dan la posibilidad de preguntarle al autor qué quiso decir. En una conversación presencial se podrían observar los gestos, el tono de voz y la seguridad de la persona, pero aquí esos elementos no están. Además, hablar de una bomba provoca miedo y hace que los estudiantes reaccionen antes de pensar con calma. Por eso el canal ayuda a que el aviso llegue rápido, pero también facilita que el rumor se agrande. Si la misma información hubiera aparecido en un comunicado del Metro, de la policía o del centro educativo, los estudiantes habrían tenido más razones para confiar y sabrían qué hacer.</w:t>
+        <w:t>El canal influye mucho, porque una misma información puede generar reacciones distintas según dónde y cómo se comunique. En el video, el aviso se comparte por redes sociales, un medio que los estudiantes usan todos los días y al que le prestan atención rápidamente. Como el mensaje se difunde entre compañeros, varios piensan que debe ser cierto, aunque nadie muestre una fuente oficial. También pasa que, cuando una publicación se comparte muchas veces, parece más confiable de lo que realmente es. Las redes permiten informar en pocos segundos, pero no siempre entregan contexto ni dan la posibilidad de preguntarle al autor qué quiso decir. En una conversación presencial se podrían observar los gestos, el tono de voz y la seguridad de la persona, pero aquí esos elementos no están. Además, hablar de una bomba provoca miedo y hace que los estudiantes reaccionen antes de pensar con calma. Por eso el canal ayuda a que el aviso llegue rápido, pero también facilita que el rumor se agrande. Si la misma información hubiera aparecido en un comunicado del Metro, de la policía o del centro educativo, los estudiantes habrían tenido más razones para confiar y sabrían qué hacer. Esto demuestra la importancia de adaptar el canal al contexto, a la audiencia y al tipo de mensaje que se necesita comunicar.</w:t>
       </w:r>
     </w:p>
     <w:p>
@@ -125,7 +125,7 @@
           <w:b w:val="0"/>
           <w:sz w:val="24"/>
         </w:rPr>
-        <w:t>En esta situación veo varias barreras de comunicación. La primera es que no se conoce al verdadero emisor, por lo que nadie sabe si el aviso viene de una autoridad o de otro estudiante. Otra barrera es que el mensaje parece tener pocos detalles: no se explica bien dónde está la bomba, a qué hora ocurrió el aviso ni quién confirmó la información. También hay mucho ruido en las redes sociales, porque allí se mezclan noticias, opiniones, bromas y rumores. El miedo es otra dificultad importante. Al tratarse de una posible bomba, los jóvenes se preocupan y toman una decisión rápida sin revisar primero si la información es real. Además, como casi todos piensan igual, se produce una especie de presión del grupo que hace más difícil cuestionar el mensaje. Considero que las redes sí sirven para avisar rápidamente a estudiantes, pero no son suficientes para una situación tan seria. Lo adecuado sería revisar primero los canales oficiales del Metro, la policía o la institución educativa. Las redes podrían usarse como apoyo, pero el mensaje tendría que incluir la fuente, la hora y un enlace oficial para comprobarlo.</w:t>
+        <w:t>En esta situación veo varios quiebres o barreras de comunicación. La primera es la falta de claridad, porque no se conoce al verdadero emisor, por lo que nadie sabe si el aviso viene de una autoridad o de otro estudiante. Otra barrera es que el mensaje parece tener pocos detalles: no se explica bien dónde está la bomba, a qué hora ocurrió el aviso ni quién confirmó la información. También existe una sobrecarga de información en las redes, porque allí se mezclan noticias, opiniones, bromas y rumores. El miedo es un problema emocional que también actúa como barrera. Al tratarse de una posible bomba, los jóvenes se preocupan y toman una decisión rápida sin revisar primero si la información es real. Esto muestra una falta de escucha activa y de clarificación, ya que nadie hace preguntas al supuesto emisor. Además, como casi todos piensan igual, se produce una especie de presión del grupo que hace más difícil cuestionar el mensaje. Considero que las redes sí sirven para avisar rápidamente a estudiantes, pero no son suficientes para una situación tan seria. Lo adecuado sería revisar primero los canales oficiales del Metro, la policía o la institución educativa. Las redes podrían usarse como apoyo, pero el mensaje tendría que incluir la fuente, la hora y un enlace oficial para comprobarlo.</w:t>
       </w:r>
     </w:p>
     <w:p>
@@ -153,7 +153,7 @@
           <w:b w:val="0"/>
           <w:sz w:val="24"/>
         </w:rPr>
-        <w:t>Después de ver el cortometraje, mi conclusión es que un mensaje puede influir mucho en las personas aunque no esté confirmado. El aviso funciona para convencer a la mayoría, porque los estudiantes deciden no usar el metro y tampoco van a clases. Sin embargo, yo no diría que la comunicación es realmente efectiva. Logra una reacción, pero la información no es clara, no se conoce su origen y los receptores no comprueban si es verdadera. El video muestra que las redes sociales tienen un gran poder para persuadir, especialmente cuando el mensaje provoca miedo o preocupación. También muestra que compartir algo muchas veces no lo convierte en verdad. Los estudiantes podrían haber buscado un aviso oficial, preguntado al profesor o revisado la información del Metro de Madrid antes de tomar una decisión. El mensaje también debería haber indicado quién lo emitió, cuándo ocurrió el hecho y cuáles eran las instrucciones. Pienso que se podría mejorar la escucha activa, la verificación de fuentes y la comunicación entre el centro educativo y sus estudiantes. De esa forma se evitarían rumores y cada persona podría decidir basándose en información confiable, no solamente en lo que otros publican.</w:t>
+        <w:t>Después de ver el cortometraje, mi conclusión es que un mensaje puede influir mucho en las personas aunque no esté confirmado. El aviso funciona para convencer a la mayoría, porque los estudiantes deciden no usar el metro y tampoco van a clases. Sin embargo, yo no diría que la comunicación es realmente efectiva. Logra una reacción, pero la información no es clara, no se conoce su origen y los receptores no comprueban si es verdadera. El video muestra que las redes sociales tienen un gran poder para persuadir, especialmente cuando el mensaje provoca miedo o preocupación. También muestra que compartir algo muchas veces no lo convierte en verdad. Aunque el aviso se presenta como una afirmación, los estudiantes lo aceptan como un hecho sin tener pruebas. Podrían haber buscado un aviso oficial, preguntado al profesor o revisado la información del Metro de Madrid antes de tomar una decisión. El mensaje también debería haber indicado quién lo emitió, cuándo ocurrió el hecho y cuáles eran las instrucciones. Pienso que se podría mejorar la escucha activa, la verificación de fuentes y la comunicación entre el centro educativo y sus estudiantes. También sería útil pedir retroalimentación para comprobar que todos entendieron el aviso. De esa forma se evitarían rumores y cada persona podría decidir basándose en información confiable, no solamente en lo que otros publican.</w:t>
       </w:r>
     </w:p>
     <w:sectPr>

</xml_diff>